<commit_message>
Ajout du schéma du scénario (articulation des opérations dans le temps)
Conformément à la demande du cas, le scénario est désormais présenté sous
forme d'un schéma intégré à la section 2 du dossier.

Co-Authored-By: Claude Opus 4.8 <noreply@anthropic.com>
Claude-Session: https://claude.ai/code/session_01ATDvSMSRnzSzFqjiuRxJNJ
</commit_message>
<xml_diff>
--- a/gremlin/Projet_GREMLIN_dossier_de_projet.docx
+++ b/gremlin/Projet_GREMLIN_dossier_de_projet.docx
@@ -713,6 +713,55 @@
     </w:p>
     <w:p>
       <w:r>
+        <w:rPr>
+          <w:b/>
+          <w:i w:val="0"/>
+          <w:sz w:val="22"/>
+        </w:rPr>
+        <w:t>Schéma du scénario — articulation des opérations dans le temps :</w:t>
+      </w:r>
+    </w:p>
+    <w:p>
+      <w:pPr>
+        <w:jc w:val="center"/>
+      </w:pPr>
+      <w:r>
+        <w:drawing>
+          <wp:inline xmlns:a="http://schemas.openxmlformats.org/drawingml/2006/main" xmlns:pic="http://schemas.openxmlformats.org/drawingml/2006/picture">
+            <wp:extent cx="5940000" cy="2837603"/>
+            <wp:docPr id="1" name="Picture 1"/>
+            <wp:cNvGraphicFramePr>
+              <a:graphicFrameLocks noChangeAspect="1"/>
+            </wp:cNvGraphicFramePr>
+            <a:graphic>
+              <a:graphicData uri="http://schemas.openxmlformats.org/drawingml/2006/picture">
+                <pic:pic>
+                  <pic:nvPicPr>
+                    <pic:cNvPr id="0" name="schema_scenario.png"/>
+                    <pic:cNvPicPr/>
+                  </pic:nvPicPr>
+                  <pic:blipFill>
+                    <a:blip r:embed="rId9"/>
+                    <a:stretch>
+                      <a:fillRect/>
+                    </a:stretch>
+                  </pic:blipFill>
+                  <pic:spPr>
+                    <a:xfrm>
+                      <a:off x="0" y="0"/>
+                      <a:ext cx="5940000" cy="2837603"/>
+                    </a:xfrm>
+                    <a:prstGeom prst="rect"/>
+                  </pic:spPr>
+                </pic:pic>
+              </a:graphicData>
+            </a:graphic>
+          </wp:inline>
+        </w:drawing>
+      </w:r>
+    </w:p>
+    <w:p>
+      <w:r>
         <w:br w:type="page"/>
       </w:r>
     </w:p>
@@ -5738,7 +5787,7 @@
         <w:drawing>
           <wp:inline xmlns:a="http://schemas.openxmlformats.org/drawingml/2006/main" xmlns:pic="http://schemas.openxmlformats.org/drawingml/2006/picture">
             <wp:extent cx="5760000" cy="4189091"/>
-            <wp:docPr id="1" name="Picture 1"/>
+            <wp:docPr id="2" name="Picture 2"/>
             <wp:cNvGraphicFramePr>
               <a:graphicFrameLocks noChangeAspect="1"/>
             </wp:cNvGraphicFramePr>
@@ -5750,7 +5799,7 @@
                     <pic:cNvPicPr/>
                   </pic:nvPicPr>
                   <pic:blipFill>
-                    <a:blip r:embed="rId9"/>
+                    <a:blip r:embed="rId10"/>
                     <a:stretch>
                       <a:fillRect/>
                     </a:stretch>
@@ -7847,7 +7896,7 @@
         <w:drawing>
           <wp:inline xmlns:a="http://schemas.openxmlformats.org/drawingml/2006/main" xmlns:pic="http://schemas.openxmlformats.org/drawingml/2006/picture">
             <wp:extent cx="5400000" cy="3240000"/>
-            <wp:docPr id="2" name="Picture 2"/>
+            <wp:docPr id="3" name="Picture 3"/>
             <wp:cNvGraphicFramePr>
               <a:graphicFrameLocks noChangeAspect="1"/>
             </wp:cNvGraphicFramePr>
@@ -7859,7 +7908,7 @@
                     <pic:cNvPicPr/>
                   </pic:nvPicPr>
                   <pic:blipFill>
-                    <a:blip r:embed="rId10"/>
+                    <a:blip r:embed="rId11"/>
                     <a:stretch>
                       <a:fillRect/>
                     </a:stretch>

</xml_diff>

<commit_message>
Dossier GREMLIN complet: organigramme hiérarchique WBS, réseau PERT, plan de charge, sommaire
- Section 3: ajout d'un organigramme des tâches sous forme d'arbre (WBS hiérarchique)
- Section 4: ajout du réseau d'antériorités (graphe PERT) et du plan de charge des ressources
- Ajout d'un sommaire automatique (champ TOC)

Le dossier couvre l'intégralité des productions demandées par le cas.

Co-Authored-By: Claude Opus 4.8 <noreply@anthropic.com>
Claude-Session: https://claude.ai/code/session_01ATDvSMSRnzSzFqjiuRxJNJ
</commit_message>
<xml_diff>
--- a/gremlin/Projet_GREMLIN_dossier_de_projet.docx
+++ b/gremlin/Projet_GREMLIN_dossier_de_projet.docx
@@ -220,6 +220,42 @@
       </w:r>
       <w:r>
         <w:t>identification/cotation des risques et dispositif de suivi de la réalisation.</w:t>
+      </w:r>
+    </w:p>
+    <w:p>
+      <w:r>
+        <w:br w:type="page"/>
+      </w:r>
+    </w:p>
+    <w:p>
+      <w:pPr>
+        <w:pStyle w:val="Heading1"/>
+      </w:pPr>
+      <w:r>
+        <w:rPr>
+          <w:color w:val="1F3B66"/>
+        </w:rPr>
+        <w:t>Sommaire</w:t>
+      </w:r>
+    </w:p>
+    <w:p>
+      <w:r>
+        <w:rPr>
+          <w:b w:val="0"/>
+          <w:i/>
+          <w:color w:val="555555"/>
+          <w:sz w:val="18"/>
+        </w:rPr>
+        <w:t>(Pour mettre à jour le sommaire : clic droit → « Mettre à jour les champs » dans Word.)</w:t>
+      </w:r>
+    </w:p>
+    <w:p>
+      <w:r>
+        <w:fldChar w:fldCharType="begin"/>
+        <w:instrText xml:space="preserve">TOC \o "1-2" \h \z \u</w:instrText>
+        <w:fldChar w:fldCharType="separate"/>
+        <w:t>Ouvrez le document dans Word puis mettez à jour le champ pour afficher le sommaire.</w:t>
+        <w:fldChar w:fldCharType="end"/>
       </w:r>
     </w:p>
     <w:p>
@@ -883,6 +919,55 @@
           <w:i w:val="0"/>
           <w:sz w:val="22"/>
         </w:rPr>
+        <w:t>Représentation sous forme d'organigramme hiérarchique (arbre WBS) :</w:t>
+      </w:r>
+    </w:p>
+    <w:p>
+      <w:pPr>
+        <w:jc w:val="center"/>
+      </w:pPr>
+      <w:r>
+        <w:drawing>
+          <wp:inline xmlns:a="http://schemas.openxmlformats.org/drawingml/2006/main" xmlns:pic="http://schemas.openxmlformats.org/drawingml/2006/picture">
+            <wp:extent cx="5940000" cy="3346434"/>
+            <wp:docPr id="2" name="Picture 2"/>
+            <wp:cNvGraphicFramePr>
+              <a:graphicFrameLocks noChangeAspect="1"/>
+            </wp:cNvGraphicFramePr>
+            <a:graphic>
+              <a:graphicData uri="http://schemas.openxmlformats.org/drawingml/2006/picture">
+                <pic:pic>
+                  <pic:nvPicPr>
+                    <pic:cNvPr id="0" name="organigramme_taches.png"/>
+                    <pic:cNvPicPr/>
+                  </pic:nvPicPr>
+                  <pic:blipFill>
+                    <a:blip r:embed="rId10"/>
+                    <a:stretch>
+                      <a:fillRect/>
+                    </a:stretch>
+                  </pic:blipFill>
+                  <pic:spPr>
+                    <a:xfrm>
+                      <a:off x="0" y="0"/>
+                      <a:ext cx="5940000" cy="3346434"/>
+                    </a:xfrm>
+                    <a:prstGeom prst="rect"/>
+                  </pic:spPr>
+                </pic:pic>
+              </a:graphicData>
+            </a:graphic>
+          </wp:inline>
+        </w:drawing>
+      </w:r>
+    </w:p>
+    <w:p>
+      <w:r>
+        <w:rPr>
+          <w:b/>
+          <w:i w:val="0"/>
+          <w:sz w:val="22"/>
+        </w:rPr>
         <w:t>Liste complète des 22 tâches élémentaires (données du cas) :</w:t>
       </w:r>
     </w:p>
@@ -3467,7 +3552,67 @@
         <w:rPr>
           <w:color w:val="1F3B66"/>
         </w:rPr>
-        <w:t>4.2 Calcul des dates et des marges (méthode des potentiels)</w:t>
+        <w:t>4.2 Réseau d'antériorités (graphe PERT)</w:t>
+      </w:r>
+    </w:p>
+    <w:p>
+      <w:r>
+        <w:rPr>
+          <w:b w:val="0"/>
+          <w:i w:val="0"/>
+          <w:sz w:val="22"/>
+        </w:rPr>
+        <w:t>Le graphe ci-dessous représente l'enchaînement logique des 22 tâches. Le chemin critique (plus longue chaîne, marge nulle) apparaît en rouge :</w:t>
+      </w:r>
+    </w:p>
+    <w:p>
+      <w:pPr>
+        <w:jc w:val="center"/>
+      </w:pPr>
+      <w:r>
+        <w:drawing>
+          <wp:inline xmlns:a="http://schemas.openxmlformats.org/drawingml/2006/main" xmlns:pic="http://schemas.openxmlformats.org/drawingml/2006/picture">
+            <wp:extent cx="5940000" cy="3151837"/>
+            <wp:docPr id="3" name="Picture 3"/>
+            <wp:cNvGraphicFramePr>
+              <a:graphicFrameLocks noChangeAspect="1"/>
+            </wp:cNvGraphicFramePr>
+            <a:graphic>
+              <a:graphicData uri="http://schemas.openxmlformats.org/drawingml/2006/picture">
+                <pic:pic>
+                  <pic:nvPicPr>
+                    <pic:cNvPr id="0" name="reseau_pert.png"/>
+                    <pic:cNvPicPr/>
+                  </pic:nvPicPr>
+                  <pic:blipFill>
+                    <a:blip r:embed="rId11"/>
+                    <a:stretch>
+                      <a:fillRect/>
+                    </a:stretch>
+                  </pic:blipFill>
+                  <pic:spPr>
+                    <a:xfrm>
+                      <a:off x="0" y="0"/>
+                      <a:ext cx="5940000" cy="3151837"/>
+                    </a:xfrm>
+                    <a:prstGeom prst="rect"/>
+                  </pic:spPr>
+                </pic:pic>
+              </a:graphicData>
+            </a:graphic>
+          </wp:inline>
+        </w:drawing>
+      </w:r>
+    </w:p>
+    <w:p>
+      <w:pPr>
+        <w:pStyle w:val="Heading2"/>
+      </w:pPr>
+      <w:r>
+        <w:rPr>
+          <w:color w:val="1F3B66"/>
+        </w:rPr>
+        <w:t>4.3 Calcul des dates et des marges (méthode des potentiels)</w:t>
       </w:r>
     </w:p>
     <w:p>
@@ -5715,7 +5860,7 @@
         <w:rPr>
           <w:color w:val="1F3B66"/>
         </w:rPr>
-        <w:t>4.3 Chemin critique et durée totale</w:t>
+        <w:t>4.4 Chemin critique et durée totale</w:t>
       </w:r>
     </w:p>
     <w:p>
@@ -5776,7 +5921,7 @@
         <w:rPr>
           <w:color w:val="1F3B66"/>
         </w:rPr>
-        <w:t>4.4 Diagramme de Gantt</w:t>
+        <w:t>4.5 Diagramme de Gantt</w:t>
       </w:r>
     </w:p>
     <w:p>
@@ -5787,7 +5932,7 @@
         <w:drawing>
           <wp:inline xmlns:a="http://schemas.openxmlformats.org/drawingml/2006/main" xmlns:pic="http://schemas.openxmlformats.org/drawingml/2006/picture">
             <wp:extent cx="5760000" cy="4189091"/>
-            <wp:docPr id="2" name="Picture 2"/>
+            <wp:docPr id="4" name="Picture 4"/>
             <wp:cNvGraphicFramePr>
               <a:graphicFrameLocks noChangeAspect="1"/>
             </wp:cNvGraphicFramePr>
@@ -5799,7 +5944,7 @@
                     <pic:cNvPicPr/>
                   </pic:nvPicPr>
                   <pic:blipFill>
-                    <a:blip r:embed="rId10"/>
+                    <a:blip r:embed="rId12"/>
                     <a:stretch>
                       <a:fillRect/>
                     </a:stretch>
@@ -5816,6 +5961,76 @@
             </a:graphic>
           </wp:inline>
         </w:drawing>
+      </w:r>
+    </w:p>
+    <w:p>
+      <w:pPr>
+        <w:pStyle w:val="Heading2"/>
+      </w:pPr>
+      <w:r>
+        <w:rPr>
+          <w:color w:val="1F3B66"/>
+        </w:rPr>
+        <w:t>4.6 Plan de charge des ressources</w:t>
+      </w:r>
+    </w:p>
+    <w:p>
+      <w:r>
+        <w:rPr>
+          <w:b w:val="0"/>
+          <w:i w:val="0"/>
+          <w:sz w:val="22"/>
+        </w:rPr>
+        <w:t>Répartition de la charge de travail (heures/jour) par catégorie de ressource, selon le planning au plus tôt. Ce plan permet de détecter d'éventuels pics et de lisser l'emploi des équipes :</w:t>
+      </w:r>
+    </w:p>
+    <w:p>
+      <w:pPr>
+        <w:jc w:val="center"/>
+      </w:pPr>
+      <w:r>
+        <w:drawing>
+          <wp:inline xmlns:a="http://schemas.openxmlformats.org/drawingml/2006/main" xmlns:pic="http://schemas.openxmlformats.org/drawingml/2006/picture">
+            <wp:extent cx="5760000" cy="2658462"/>
+            <wp:docPr id="5" name="Picture 5"/>
+            <wp:cNvGraphicFramePr>
+              <a:graphicFrameLocks noChangeAspect="1"/>
+            </wp:cNvGraphicFramePr>
+            <a:graphic>
+              <a:graphicData uri="http://schemas.openxmlformats.org/drawingml/2006/picture">
+                <pic:pic>
+                  <pic:nvPicPr>
+                    <pic:cNvPr id="0" name="plan_charge.png"/>
+                    <pic:cNvPicPr/>
+                  </pic:nvPicPr>
+                  <pic:blipFill>
+                    <a:blip r:embed="rId13"/>
+                    <a:stretch>
+                      <a:fillRect/>
+                    </a:stretch>
+                  </pic:blipFill>
+                  <pic:spPr>
+                    <a:xfrm>
+                      <a:off x="0" y="0"/>
+                      <a:ext cx="5760000" cy="2658462"/>
+                    </a:xfrm>
+                    <a:prstGeom prst="rect"/>
+                  </pic:spPr>
+                </pic:pic>
+              </a:graphicData>
+            </a:graphic>
+          </wp:inline>
+        </w:drawing>
+      </w:r>
+    </w:p>
+    <w:p>
+      <w:r>
+        <w:rPr>
+          <w:b w:val="0"/>
+          <w:i/>
+          <w:sz w:val="20"/>
+        </w:rPr>
+        <w:t>Total des charges : Ingénieur 204 h, Technicien 68 h, Acheteur 32 h, Ouvrier 410 h (hors Atelier et Fournisseur, prestations externes).</w:t>
       </w:r>
     </w:p>
     <w:p>
@@ -7896,7 +8111,7 @@
         <w:drawing>
           <wp:inline xmlns:a="http://schemas.openxmlformats.org/drawingml/2006/main" xmlns:pic="http://schemas.openxmlformats.org/drawingml/2006/picture">
             <wp:extent cx="5400000" cy="3240000"/>
-            <wp:docPr id="3" name="Picture 3"/>
+            <wp:docPr id="6" name="Picture 6"/>
             <wp:cNvGraphicFramePr>
               <a:graphicFrameLocks noChangeAspect="1"/>
             </wp:cNvGraphicFramePr>
@@ -7908,7 +8123,7 @@
                     <pic:cNvPicPr/>
                   </pic:nvPicPr>
                   <pic:blipFill>
-                    <a:blip r:embed="rId11"/>
+                    <a:blip r:embed="rId14"/>
                     <a:stretch>
                       <a:fillRect/>
                     </a:stretch>

</xml_diff>